<commit_message>
docs: update progress reports and test cases for Kato development
</commit_message>
<xml_diff>
--- a/docs/laporan-kemajuan/laporan-kemajuan-pengembangan.docx
+++ b/docs/laporan-kemajuan/laporan-kemajuan-pengembangan.docx
@@ -22520,7 +22520,7 @@
           <w:b w:val="0"/>
           <w:sz w:val="21"/>
         </w:rPr>
-        <w:t>Jadwal di bawah memakai perkiraan UAS pada pertengahan Desember 2026. Kolom penanggung jawab diisi sesuai pembagian tugas kelompok.</w:t>
+        <w:t>Pengembangan dimulai awal September 2026 dan ditargetkan selesai akhir November 2026, sebelum UAS. Tahapan September sampai 13 Oktober sudah selesai; tanggalnya diambil dari riwayat commit Git. Kolom penanggung jawab diisi sesuai pembagian tugas kelompok.</w:t>
       </w:r>
     </w:p>
     <w:tbl>
@@ -22539,10 +22539,11 @@
         <w:tblLook w:firstColumn="1" w:firstRow="1" w:lastColumn="0" w:lastRow="0" w:noHBand="0" w:noVBand="1" w:val="04A0"/>
       </w:tblPr>
       <w:tblGrid>
-        <w:gridCol w:w="1455"/>
-        <w:gridCol w:w="3273"/>
-        <w:gridCol w:w="1637"/>
-        <w:gridCol w:w="3273"/>
+        <w:gridCol w:w="1314"/>
+        <w:gridCol w:w="3242"/>
+        <w:gridCol w:w="1490"/>
+        <w:gridCol w:w="2541"/>
+        <w:gridCol w:w="1051"/>
       </w:tblGrid>
       <w:tr>
         <w:trPr>
@@ -22550,7 +22551,7 @@
         </w:trPr>
         <w:tc>
           <w:tcPr>
-            <w:tcW w:type="dxa" w:w="1455"/>
+            <w:tcW w:type="dxa" w:w="1314"/>
             <w:shd w:val="clear" w:color="auto" w:fill="1F4E79"/>
           </w:tcPr>
           <w:p>
@@ -22570,7 +22571,7 @@
         </w:tc>
         <w:tc>
           <w:tcPr>
-            <w:tcW w:type="dxa" w:w="3273"/>
+            <w:tcW w:type="dxa" w:w="3242"/>
             <w:shd w:val="clear" w:color="auto" w:fill="1F4E79"/>
           </w:tcPr>
           <w:p>
@@ -22590,7 +22591,7 @@
         </w:tc>
         <w:tc>
           <w:tcPr>
-            <w:tcW w:type="dxa" w:w="1637"/>
+            <w:tcW w:type="dxa" w:w="1490"/>
             <w:shd w:val="clear" w:color="auto" w:fill="1F4E79"/>
           </w:tcPr>
           <w:p>
@@ -22610,7 +22611,7 @@
         </w:tc>
         <w:tc>
           <w:tcPr>
-            <w:tcW w:type="dxa" w:w="3273"/>
+            <w:tcW w:type="dxa" w:w="2541"/>
             <w:shd w:val="clear" w:color="auto" w:fill="1F4E79"/>
           </w:tcPr>
           <w:p>
@@ -22625,6 +22626,26 @@
                 <w:sz w:val="17"/>
               </w:rPr>
               <w:t>Target penyelesaian / luaran</w:t>
+            </w:r>
+          </w:p>
+        </w:tc>
+        <w:tc>
+          <w:tcPr>
+            <w:tcW w:type="dxa" w:w="1051"/>
+            <w:shd w:val="clear" w:color="auto" w:fill="1F4E79"/>
+          </w:tcPr>
+          <w:p>
+            <w:pPr>
+              <w:spacing w:before="0" w:after="0"/>
+            </w:pPr>
+            <w:r>
+              <w:rPr>
+                <w:rFonts w:ascii="Calibri" w:hAnsi="Calibri" w:cs="Calibri" w:eastAsia="Calibri"/>
+                <w:b/>
+                <w:color w:val="FFFFFF"/>
+                <w:sz w:val="17"/>
+              </w:rPr>
+              <w:t>Status</w:t>
             </w:r>
           </w:p>
         </w:tc>
@@ -22635,90 +22656,91 @@
         </w:trPr>
         <w:tc>
           <w:tcPr>
-            <w:tcW w:type="dxa" w:w="1455"/>
-          </w:tcPr>
-          <w:p>
-            <w:pPr>
-              <w:spacing w:before="0" w:after="0"/>
-            </w:pPr>
-            <w:r>
-              <w:rPr>
-                <w:rFonts w:ascii="Calibri" w:hAnsi="Calibri" w:cs="Calibri" w:eastAsia="Calibri"/>
-                <w:b w:val="0"/>
-                <w:sz w:val="17"/>
-              </w:rPr>
-              <w:t>14–20 Okt</w:t>
-            </w:r>
-          </w:p>
-        </w:tc>
-        <w:tc>
-          <w:tcPr>
-            <w:tcW w:type="dxa" w:w="3273"/>
-          </w:tcPr>
-          <w:p>
-            <w:pPr>
-              <w:spacing w:before="0" w:after="0"/>
-            </w:pPr>
-            <w:r>
-              <w:rPr>
-                <w:rFonts w:ascii="Calibri" w:hAnsi="Calibri" w:cs="Calibri" w:eastAsia="Calibri"/>
-                <w:b w:val="0"/>
-                <w:sz w:val="17"/>
-              </w:rPr>
-              <w:t xml:space="preserve">Ganti sandi supervisor produksi; keluarkan </w:t>
-            </w:r>
-            <w:r>
-              <w:rPr>
-                <w:rFonts w:ascii="Consolas" w:hAnsi="Consolas" w:cs="Consolas" w:eastAsia="Consolas"/>
-                <w:b w:val="0"/>
-                <w:sz w:val="15"/>
-                <w:shd w:val="clear" w:color="auto" w:fill="F2F2F2"/>
-              </w:rPr>
-              <w:t>backup.sql</w:t>
-            </w:r>
-            <w:r>
-              <w:rPr>
-                <w:rFonts w:ascii="Calibri" w:hAnsi="Calibri" w:cs="Calibri" w:eastAsia="Calibri"/>
-                <w:b w:val="0"/>
-                <w:sz w:val="17"/>
-              </w:rPr>
-              <w:t xml:space="preserve"> dari repositori; eksekusi seluruh test case fungsional</w:t>
-            </w:r>
-          </w:p>
-        </w:tc>
-        <w:tc>
-          <w:tcPr>
-            <w:tcW w:type="dxa" w:w="1637"/>
-          </w:tcPr>
-          <w:p>
-            <w:pPr>
-              <w:spacing w:before="0" w:after="0"/>
-            </w:pPr>
-            <w:r>
-              <w:rPr>
-                <w:rFonts w:ascii="Calibri" w:hAnsi="Calibri" w:cs="Calibri" w:eastAsia="Calibri"/>
-                <w:b w:val="0"/>
-                <w:sz w:val="17"/>
-              </w:rPr>
-              <w:t>[Nama] — backend</w:t>
-            </w:r>
-          </w:p>
-        </w:tc>
-        <w:tc>
-          <w:tcPr>
-            <w:tcW w:type="dxa" w:w="3273"/>
-          </w:tcPr>
-          <w:p>
-            <w:pPr>
-              <w:spacing w:before="0" w:after="0"/>
-            </w:pPr>
-            <w:r>
-              <w:rPr>
-                <w:rFonts w:ascii="Calibri" w:hAnsi="Calibri" w:cs="Calibri" w:eastAsia="Calibri"/>
-                <w:b w:val="0"/>
-                <w:sz w:val="17"/>
-              </w:rPr>
-              <w:t>Sandi bawaan tidak berlaku; semua test case berstatus Lulus/Gagal; daftar bug</w:t>
+            <w:tcW w:type="dxa" w:w="1314"/>
+          </w:tcPr>
+          <w:p>
+            <w:pPr>
+              <w:spacing w:before="0" w:after="0"/>
+            </w:pPr>
+            <w:r>
+              <w:rPr>
+                <w:rFonts w:ascii="Calibri" w:hAnsi="Calibri" w:cs="Calibri" w:eastAsia="Calibri"/>
+                <w:b w:val="0"/>
+                <w:sz w:val="17"/>
+              </w:rPr>
+              <w:t>1–10 Sep</w:t>
+            </w:r>
+          </w:p>
+        </w:tc>
+        <w:tc>
+          <w:tcPr>
+            <w:tcW w:type="dxa" w:w="3242"/>
+          </w:tcPr>
+          <w:p>
+            <w:pPr>
+              <w:spacing w:before="0" w:after="0"/>
+            </w:pPr>
+            <w:r>
+              <w:rPr>
+                <w:rFonts w:ascii="Calibri" w:hAnsi="Calibri" w:cs="Calibri" w:eastAsia="Calibri"/>
+                <w:b w:val="0"/>
+                <w:sz w:val="17"/>
+              </w:rPr>
+              <w:t>Analisis kebutuhan; perancangan database dan arsitektur; inti sistem: QR per lantai, formulir laporan, klasifikasi dan prioritas LLM, dashboard, akun dan papan peringkat, papan publik, grafik, log aktivitas</w:t>
+            </w:r>
+          </w:p>
+        </w:tc>
+        <w:tc>
+          <w:tcPr>
+            <w:tcW w:type="dxa" w:w="1490"/>
+          </w:tcPr>
+          <w:p>
+            <w:pPr>
+              <w:spacing w:before="0" w:after="0"/>
+            </w:pPr>
+            <w:r>
+              <w:rPr>
+                <w:rFonts w:ascii="Calibri" w:hAnsi="Calibri" w:cs="Calibri" w:eastAsia="Calibri"/>
+                <w:b w:val="0"/>
+                <w:sz w:val="17"/>
+              </w:rPr>
+              <w:t>[Nama] — seluruh tim</w:t>
+            </w:r>
+          </w:p>
+        </w:tc>
+        <w:tc>
+          <w:tcPr>
+            <w:tcW w:type="dxa" w:w="2541"/>
+          </w:tcPr>
+          <w:p>
+            <w:pPr>
+              <w:spacing w:before="0" w:after="0"/>
+            </w:pPr>
+            <w:r>
+              <w:rPr>
+                <w:rFonts w:ascii="Calibri" w:hAnsi="Calibri" w:cs="Calibri" w:eastAsia="Calibri"/>
+                <w:b w:val="0"/>
+                <w:sz w:val="17"/>
+              </w:rPr>
+              <w:t>Aplikasi berjalan di Cloudflare Workers (commit pertama 2 Sep)</w:t>
+            </w:r>
+          </w:p>
+        </w:tc>
+        <w:tc>
+          <w:tcPr>
+            <w:tcW w:type="dxa" w:w="1051"/>
+          </w:tcPr>
+          <w:p>
+            <w:pPr>
+              <w:spacing w:before="0" w:after="0"/>
+            </w:pPr>
+            <w:r>
+              <w:rPr>
+                <w:rFonts w:ascii="Calibri" w:hAnsi="Calibri" w:cs="Calibri" w:eastAsia="Calibri"/>
+                <w:b/>
+                <w:sz w:val="17"/>
+              </w:rPr>
+              <w:t>Selesai</w:t>
             </w:r>
           </w:p>
         </w:tc>
@@ -22729,7 +22751,7 @@
         </w:trPr>
         <w:tc>
           <w:tcPr>
-            <w:tcW w:type="dxa" w:w="1455"/>
+            <w:tcW w:type="dxa" w:w="1314"/>
             <w:shd w:val="clear" w:color="auto" w:fill="F8FAFC"/>
           </w:tcPr>
           <w:p>
@@ -22742,13 +22764,13 @@
                 <w:b w:val="0"/>
                 <w:sz w:val="17"/>
               </w:rPr>
-              <w:t>21–27 Okt</w:t>
-            </w:r>
-          </w:p>
-        </w:tc>
-        <w:tc>
-          <w:tcPr>
-            <w:tcW w:type="dxa" w:w="3273"/>
+              <w:t>11–20 Sep</w:t>
+            </w:r>
+          </w:p>
+        </w:tc>
+        <w:tc>
+          <w:tcPr>
+            <w:tcW w:type="dxa" w:w="3242"/>
             <w:shd w:val="clear" w:color="auto" w:fill="F8FAFC"/>
           </w:tcPr>
           <w:p>
@@ -22761,13 +22783,13 @@
                 <w:b w:val="0"/>
                 <w:sz w:val="17"/>
               </w:rPr>
-              <w:t>Susun 100 keluhan berlabel; uji akurasi klasifikasi dan prioritas AI teks</w:t>
-            </w:r>
-          </w:p>
-        </w:tc>
-        <w:tc>
-          <w:tcPr>
-            <w:tcW w:type="dxa" w:w="1637"/>
+              <w:t>Verifikasi foto bukti dengan AI vision (Gemini); fitur tanya data (chatbot); dokumentasi teknis dan panduan umum</w:t>
+            </w:r>
+          </w:p>
+        </w:tc>
+        <w:tc>
+          <w:tcPr>
+            <w:tcW w:type="dxa" w:w="1490"/>
             <w:shd w:val="clear" w:color="auto" w:fill="F8FAFC"/>
           </w:tcPr>
           <w:p>
@@ -22780,13 +22802,13 @@
                 <w:b w:val="0"/>
                 <w:sz w:val="17"/>
               </w:rPr>
-              <w:t>[Nama] — AI/data</w:t>
-            </w:r>
-          </w:p>
-        </w:tc>
-        <w:tc>
-          <w:tcPr>
-            <w:tcW w:type="dxa" w:w="3273"/>
+              <w:t>[Nama] — AI &amp; backend</w:t>
+            </w:r>
+          </w:p>
+        </w:tc>
+        <w:tc>
+          <w:tcPr>
+            <w:tcW w:type="dxa" w:w="2541"/>
             <w:shd w:val="clear" w:color="auto" w:fill="F8FAFC"/>
           </w:tcPr>
           <w:p>
@@ -22799,7 +22821,26 @@
                 <w:b w:val="0"/>
                 <w:sz w:val="17"/>
               </w:rPr>
-              <w:t>Tabel presisi, recall, dan F1 per kategori; akurasi prioritas</w:t>
+              <w:t>Laporan hanya selesai dengan foto bersih; chatbot menjawab dari data</w:t>
+            </w:r>
+          </w:p>
+        </w:tc>
+        <w:tc>
+          <w:tcPr>
+            <w:tcW w:type="dxa" w:w="1051"/>
+            <w:shd w:val="clear" w:color="auto" w:fill="F8FAFC"/>
+          </w:tcPr>
+          <w:p>
+            <w:pPr>
+              <w:spacing w:before="0" w:after="0"/>
+            </w:pPr>
+            <w:r>
+              <w:rPr>
+                <w:rFonts w:ascii="Calibri" w:hAnsi="Calibri" w:cs="Calibri" w:eastAsia="Calibri"/>
+                <w:b/>
+                <w:sz w:val="17"/>
+              </w:rPr>
+              <w:t>Selesai</w:t>
             </w:r>
           </w:p>
         </w:tc>
@@ -22810,73 +22851,91 @@
         </w:trPr>
         <w:tc>
           <w:tcPr>
-            <w:tcW w:type="dxa" w:w="1455"/>
-          </w:tcPr>
-          <w:p>
-            <w:pPr>
-              <w:spacing w:before="0" w:after="0"/>
-            </w:pPr>
-            <w:r>
-              <w:rPr>
-                <w:rFonts w:ascii="Calibri" w:hAnsi="Calibri" w:cs="Calibri" w:eastAsia="Calibri"/>
-                <w:b w:val="0"/>
-                <w:sz w:val="17"/>
-              </w:rPr>
-              <w:t>28 Okt–3 Nov</w:t>
-            </w:r>
-          </w:p>
-        </w:tc>
-        <w:tc>
-          <w:tcPr>
-            <w:tcW w:type="dxa" w:w="3273"/>
-          </w:tcPr>
-          <w:p>
-            <w:pPr>
-              <w:spacing w:before="0" w:after="0"/>
-            </w:pPr>
-            <w:r>
-              <w:rPr>
-                <w:rFonts w:ascii="Calibri" w:hAnsi="Calibri" w:cs="Calibri" w:eastAsia="Calibri"/>
-                <w:b w:val="0"/>
-                <w:sz w:val="17"/>
-              </w:rPr>
-              <w:t>Susun 60 foto berlabel (bersih/kotor/bukan toilet); uji akurasi vision</w:t>
-            </w:r>
-          </w:p>
-        </w:tc>
-        <w:tc>
-          <w:tcPr>
-            <w:tcW w:type="dxa" w:w="1637"/>
-          </w:tcPr>
-          <w:p>
-            <w:pPr>
-              <w:spacing w:before="0" w:after="0"/>
-            </w:pPr>
-            <w:r>
-              <w:rPr>
-                <w:rFonts w:ascii="Calibri" w:hAnsi="Calibri" w:cs="Calibri" w:eastAsia="Calibri"/>
-                <w:b w:val="0"/>
-                <w:sz w:val="17"/>
-              </w:rPr>
-              <w:t>[Nama] — AI/data</w:t>
-            </w:r>
-          </w:p>
-        </w:tc>
-        <w:tc>
-          <w:tcPr>
-            <w:tcW w:type="dxa" w:w="3273"/>
-          </w:tcPr>
-          <w:p>
-            <w:pPr>
-              <w:spacing w:before="0" w:after="0"/>
-            </w:pPr>
-            <w:r>
-              <w:rPr>
-                <w:rFonts w:ascii="Calibri" w:hAnsi="Calibri" w:cs="Calibri" w:eastAsia="Calibri"/>
-                <w:b w:val="0"/>
-                <w:sz w:val="17"/>
-              </w:rPr>
-              <w:t>Confusion matrix; tingkat salah terima dan salah tolak</w:t>
+            <w:tcW w:type="dxa" w:w="1314"/>
+          </w:tcPr>
+          <w:p>
+            <w:pPr>
+              <w:spacing w:before="0" w:after="0"/>
+            </w:pPr>
+            <w:r>
+              <w:rPr>
+                <w:rFonts w:ascii="Calibri" w:hAnsi="Calibri" w:cs="Calibri" w:eastAsia="Calibri"/>
+                <w:b w:val="0"/>
+                <w:sz w:val="17"/>
+              </w:rPr>
+              <w:t>21–30 Sep</w:t>
+            </w:r>
+          </w:p>
+        </w:tc>
+        <w:tc>
+          <w:tcPr>
+            <w:tcW w:type="dxa" w:w="3242"/>
+          </w:tcPr>
+          <w:p>
+            <w:pPr>
+              <w:spacing w:before="0" w:after="0"/>
+            </w:pPr>
+            <w:r>
+              <w:rPr>
+                <w:rFonts w:ascii="Calibri" w:hAnsi="Calibri" w:cs="Calibri" w:eastAsia="Calibri"/>
+                <w:b w:val="0"/>
+                <w:sz w:val="17"/>
+              </w:rPr>
+              <w:t>Kamera langsung; log pekerjaan petugas; filter waktu; halaman per peran; peta gedung; BPMN, DFD, UML, PRD; identitas Kato Report; failover API key</w:t>
+            </w:r>
+          </w:p>
+        </w:tc>
+        <w:tc>
+          <w:tcPr>
+            <w:tcW w:type="dxa" w:w="1490"/>
+          </w:tcPr>
+          <w:p>
+            <w:pPr>
+              <w:spacing w:before="0" w:after="0"/>
+            </w:pPr>
+            <w:r>
+              <w:rPr>
+                <w:rFonts w:ascii="Calibri" w:hAnsi="Calibri" w:cs="Calibri" w:eastAsia="Calibri"/>
+                <w:b w:val="0"/>
+                <w:sz w:val="17"/>
+              </w:rPr>
+              <w:t>[Nama] — frontend &amp; dokumentasi</w:t>
+            </w:r>
+          </w:p>
+        </w:tc>
+        <w:tc>
+          <w:tcPr>
+            <w:tcW w:type="dxa" w:w="2541"/>
+          </w:tcPr>
+          <w:p>
+            <w:pPr>
+              <w:spacing w:before="0" w:after="0"/>
+            </w:pPr>
+            <w:r>
+              <w:rPr>
+                <w:rFonts w:ascii="Calibri" w:hAnsi="Calibri" w:cs="Calibri" w:eastAsia="Calibri"/>
+                <w:b w:val="0"/>
+                <w:sz w:val="17"/>
+              </w:rPr>
+              <w:t>Alur petugas lengkap; dokumen analisis dan perancangan</w:t>
+            </w:r>
+          </w:p>
+        </w:tc>
+        <w:tc>
+          <w:tcPr>
+            <w:tcW w:type="dxa" w:w="1051"/>
+          </w:tcPr>
+          <w:p>
+            <w:pPr>
+              <w:spacing w:before="0" w:after="0"/>
+            </w:pPr>
+            <w:r>
+              <w:rPr>
+                <w:rFonts w:ascii="Calibri" w:hAnsi="Calibri" w:cs="Calibri" w:eastAsia="Calibri"/>
+                <w:b/>
+                <w:sz w:val="17"/>
+              </w:rPr>
+              <w:t>Selesai</w:t>
             </w:r>
           </w:p>
         </w:tc>
@@ -22887,7 +22946,7 @@
         </w:trPr>
         <w:tc>
           <w:tcPr>
-            <w:tcW w:type="dxa" w:w="1455"/>
+            <w:tcW w:type="dxa" w:w="1314"/>
             <w:shd w:val="clear" w:color="auto" w:fill="F8FAFC"/>
           </w:tcPr>
           <w:p>
@@ -22900,13 +22959,13 @@
                 <w:b w:val="0"/>
                 <w:sz w:val="17"/>
               </w:rPr>
-              <w:t>4–10 Nov</w:t>
-            </w:r>
-          </w:p>
-        </w:tc>
-        <w:tc>
-          <w:tcPr>
-            <w:tcW w:type="dxa" w:w="3273"/>
+              <w:t>1–13 Okt</w:t>
+            </w:r>
+          </w:p>
+        </w:tc>
+        <w:tc>
+          <w:tcPr>
+            <w:tcW w:type="dxa" w:w="3242"/>
             <w:shd w:val="clear" w:color="auto" w:fill="F8FAFC"/>
           </w:tcPr>
           <w:p>
@@ -22919,13 +22978,13 @@
                 <w:b w:val="0"/>
                 <w:sz w:val="17"/>
               </w:rPr>
-              <w:t>Pembatasan laju atau Cloudflare Turnstile saat melapor; PIN petugas</w:t>
-            </w:r>
-          </w:p>
-        </w:tc>
-        <w:tc>
-          <w:tcPr>
-            <w:tcW w:type="dxa" w:w="1637"/>
+              <w:t>Pembaruan UML; perapian kode; penyusunan test case; uji awal 38 kasus API; laporan kemajuan</w:t>
+            </w:r>
+          </w:p>
+        </w:tc>
+        <w:tc>
+          <w:tcPr>
+            <w:tcW w:type="dxa" w:w="1490"/>
             <w:shd w:val="clear" w:color="auto" w:fill="F8FAFC"/>
           </w:tcPr>
           <w:p>
@@ -22938,13 +22997,13 @@
                 <w:b w:val="0"/>
                 <w:sz w:val="17"/>
               </w:rPr>
-              <w:t>[Nama] — backend</w:t>
-            </w:r>
-          </w:p>
-        </w:tc>
-        <w:tc>
-          <w:tcPr>
-            <w:tcW w:type="dxa" w:w="3273"/>
+              <w:t>[Nama] — QA &amp; dokumentasi</w:t>
+            </w:r>
+          </w:p>
+        </w:tc>
+        <w:tc>
+          <w:tcPr>
+            <w:tcW w:type="dxa" w:w="2541"/>
             <w:shd w:val="clear" w:color="auto" w:fill="F8FAFC"/>
           </w:tcPr>
           <w:p>
@@ -22957,7 +23016,26 @@
                 <w:b w:val="0"/>
                 <w:sz w:val="17"/>
               </w:rPr>
-              <w:t>Spam tertahan; status tidak bisa diubah atas nama petugas lain</w:t>
+              <w:t>Dokumen test case; laporan kemajuan ini</w:t>
+            </w:r>
+          </w:p>
+        </w:tc>
+        <w:tc>
+          <w:tcPr>
+            <w:tcW w:type="dxa" w:w="1051"/>
+            <w:shd w:val="clear" w:color="auto" w:fill="F8FAFC"/>
+          </w:tcPr>
+          <w:p>
+            <w:pPr>
+              <w:spacing w:before="0" w:after="0"/>
+            </w:pPr>
+            <w:r>
+              <w:rPr>
+                <w:rFonts w:ascii="Calibri" w:hAnsi="Calibri" w:cs="Calibri" w:eastAsia="Calibri"/>
+                <w:b/>
+                <w:sz w:val="17"/>
+              </w:rPr>
+              <w:t>Selesai</w:t>
             </w:r>
           </w:p>
         </w:tc>
@@ -22968,73 +23046,108 @@
         </w:trPr>
         <w:tc>
           <w:tcPr>
-            <w:tcW w:type="dxa" w:w="1455"/>
-          </w:tcPr>
-          <w:p>
-            <w:pPr>
-              <w:spacing w:before="0" w:after="0"/>
-            </w:pPr>
-            <w:r>
-              <w:rPr>
-                <w:rFonts w:ascii="Calibri" w:hAnsi="Calibri" w:cs="Calibri" w:eastAsia="Calibri"/>
-                <w:b w:val="0"/>
-                <w:sz w:val="17"/>
-              </w:rPr>
-              <w:t>11–17 Nov</w:t>
-            </w:r>
-          </w:p>
-        </w:tc>
-        <w:tc>
-          <w:tcPr>
-            <w:tcW w:type="dxa" w:w="3273"/>
-          </w:tcPr>
-          <w:p>
-            <w:pPr>
-              <w:spacing w:before="0" w:after="0"/>
-            </w:pPr>
-            <w:r>
-              <w:rPr>
-                <w:rFonts w:ascii="Calibri" w:hAnsi="Calibri" w:cs="Calibri" w:eastAsia="Calibri"/>
-                <w:b w:val="0"/>
-                <w:sz w:val="17"/>
-              </w:rPr>
-              <w:t>Rekap manajerial (mingguan, bulanan, per lokasi, per petugas), KPI SLA, filter kategori; ekspor CSV, Excel, dan PDF</w:t>
-            </w:r>
-          </w:p>
-        </w:tc>
-        <w:tc>
-          <w:tcPr>
-            <w:tcW w:type="dxa" w:w="1637"/>
-          </w:tcPr>
-          <w:p>
-            <w:pPr>
-              <w:spacing w:before="0" w:after="0"/>
-            </w:pPr>
-            <w:r>
-              <w:rPr>
-                <w:rFonts w:ascii="Calibri" w:hAnsi="Calibri" w:cs="Calibri" w:eastAsia="Calibri"/>
-                <w:b w:val="0"/>
-                <w:sz w:val="17"/>
-              </w:rPr>
-              <w:t>[Nama] — backend &amp; frontend</w:t>
-            </w:r>
-          </w:p>
-        </w:tc>
-        <w:tc>
-          <w:tcPr>
-            <w:tcW w:type="dxa" w:w="3273"/>
-          </w:tcPr>
-          <w:p>
-            <w:pPr>
-              <w:spacing w:before="0" w:after="0"/>
-            </w:pPr>
-            <w:r>
-              <w:rPr>
-                <w:rFonts w:ascii="Calibri" w:hAnsi="Calibri" w:cs="Calibri" w:eastAsia="Calibri"/>
-                <w:b w:val="0"/>
-                <w:sz w:val="17"/>
-              </w:rPr>
-              <w:t>Halaman rekap manajerial sesuai mockup A.9; tiga format ekspor berjalan</w:t>
+            <w:tcW w:type="dxa" w:w="1314"/>
+          </w:tcPr>
+          <w:p>
+            <w:pPr>
+              <w:spacing w:before="0" w:after="0"/>
+            </w:pPr>
+            <w:r>
+              <w:rPr>
+                <w:rFonts w:ascii="Calibri" w:hAnsi="Calibri" w:cs="Calibri" w:eastAsia="Calibri"/>
+                <w:b w:val="0"/>
+                <w:sz w:val="17"/>
+              </w:rPr>
+              <w:t>14–20 Okt</w:t>
+            </w:r>
+          </w:p>
+        </w:tc>
+        <w:tc>
+          <w:tcPr>
+            <w:tcW w:type="dxa" w:w="3242"/>
+          </w:tcPr>
+          <w:p>
+            <w:pPr>
+              <w:spacing w:before="0" w:after="0"/>
+            </w:pPr>
+            <w:r>
+              <w:rPr>
+                <w:rFonts w:ascii="Calibri" w:hAnsi="Calibri" w:cs="Calibri" w:eastAsia="Calibri"/>
+                <w:b w:val="0"/>
+                <w:sz w:val="17"/>
+              </w:rPr>
+              <w:t xml:space="preserve">Ganti sandi supervisor produksi; keluarkan </w:t>
+            </w:r>
+            <w:r>
+              <w:rPr>
+                <w:rFonts w:ascii="Consolas" w:hAnsi="Consolas" w:cs="Consolas" w:eastAsia="Consolas"/>
+                <w:b w:val="0"/>
+                <w:sz w:val="15"/>
+                <w:shd w:val="clear" w:color="auto" w:fill="F2F2F2"/>
+              </w:rPr>
+              <w:t>backup.sql</w:t>
+            </w:r>
+            <w:r>
+              <w:rPr>
+                <w:rFonts w:ascii="Calibri" w:hAnsi="Calibri" w:cs="Calibri" w:eastAsia="Calibri"/>
+                <w:b w:val="0"/>
+                <w:sz w:val="17"/>
+              </w:rPr>
+              <w:t xml:space="preserve"> dari repositori; eksekusi seluruh test case fungsional</w:t>
+            </w:r>
+          </w:p>
+        </w:tc>
+        <w:tc>
+          <w:tcPr>
+            <w:tcW w:type="dxa" w:w="1490"/>
+          </w:tcPr>
+          <w:p>
+            <w:pPr>
+              <w:spacing w:before="0" w:after="0"/>
+            </w:pPr>
+            <w:r>
+              <w:rPr>
+                <w:rFonts w:ascii="Calibri" w:hAnsi="Calibri" w:cs="Calibri" w:eastAsia="Calibri"/>
+                <w:b w:val="0"/>
+                <w:sz w:val="17"/>
+              </w:rPr>
+              <w:t>[Nama] — backend &amp; QA</w:t>
+            </w:r>
+          </w:p>
+        </w:tc>
+        <w:tc>
+          <w:tcPr>
+            <w:tcW w:type="dxa" w:w="2541"/>
+          </w:tcPr>
+          <w:p>
+            <w:pPr>
+              <w:spacing w:before="0" w:after="0"/>
+            </w:pPr>
+            <w:r>
+              <w:rPr>
+                <w:rFonts w:ascii="Calibri" w:hAnsi="Calibri" w:cs="Calibri" w:eastAsia="Calibri"/>
+                <w:b w:val="0"/>
+                <w:sz w:val="17"/>
+              </w:rPr>
+              <w:t>Sandi bawaan tidak berlaku; semua test case berstatus Lulus/Gagal; daftar bug</w:t>
+            </w:r>
+          </w:p>
+        </w:tc>
+        <w:tc>
+          <w:tcPr>
+            <w:tcW w:type="dxa" w:w="1051"/>
+          </w:tcPr>
+          <w:p>
+            <w:pPr>
+              <w:spacing w:before="0" w:after="0"/>
+            </w:pPr>
+            <w:r>
+              <w:rPr>
+                <w:rFonts w:ascii="Calibri" w:hAnsi="Calibri" w:cs="Calibri" w:eastAsia="Calibri"/>
+                <w:b w:val="0"/>
+                <w:sz w:val="17"/>
+              </w:rPr>
+              <w:t>Berikutnya</w:t>
             </w:r>
           </w:p>
         </w:tc>
@@ -23045,7 +23158,7 @@
         </w:trPr>
         <w:tc>
           <w:tcPr>
-            <w:tcW w:type="dxa" w:w="1455"/>
+            <w:tcW w:type="dxa" w:w="1314"/>
             <w:shd w:val="clear" w:color="auto" w:fill="F8FAFC"/>
           </w:tcPr>
           <w:p>
@@ -23058,13 +23171,13 @@
                 <w:b w:val="0"/>
                 <w:sz w:val="17"/>
               </w:rPr>
-              <w:t>18–24 Nov</w:t>
-            </w:r>
-          </w:p>
-        </w:tc>
-        <w:tc>
-          <w:tcPr>
-            <w:tcW w:type="dxa" w:w="3273"/>
+              <w:t>21–27 Okt</w:t>
+            </w:r>
+          </w:p>
+        </w:tc>
+        <w:tc>
+          <w:tcPr>
+            <w:tcW w:type="dxa" w:w="3242"/>
             <w:shd w:val="clear" w:color="auto" w:fill="F8FAFC"/>
           </w:tcPr>
           <w:p>
@@ -23077,13 +23190,13 @@
                 <w:b w:val="0"/>
                 <w:sz w:val="17"/>
               </w:rPr>
-              <w:t>Notifikasi prioritas tinggi; penutupan laporan dari log pekerjaan; uji otomatis (Vitest); reset sandi supervisor</w:t>
-            </w:r>
-          </w:p>
-        </w:tc>
-        <w:tc>
-          <w:tcPr>
-            <w:tcW w:type="dxa" w:w="1637"/>
+              <w:t>Susun 100 keluhan dan 60 foto berlabel; uji akurasi AI teks dan vision</w:t>
+            </w:r>
+          </w:p>
+        </w:tc>
+        <w:tc>
+          <w:tcPr>
+            <w:tcW w:type="dxa" w:w="1490"/>
             <w:shd w:val="clear" w:color="auto" w:fill="F8FAFC"/>
           </w:tcPr>
           <w:p>
@@ -23096,13 +23209,13 @@
                 <w:b w:val="0"/>
                 <w:sz w:val="17"/>
               </w:rPr>
-              <w:t>[Nama] — backend &amp; QA</w:t>
-            </w:r>
-          </w:p>
-        </w:tc>
-        <w:tc>
-          <w:tcPr>
-            <w:tcW w:type="dxa" w:w="3273"/>
+              <w:t>[Nama] — AI/data</w:t>
+            </w:r>
+          </w:p>
+        </w:tc>
+        <w:tc>
+          <w:tcPr>
+            <w:tcW w:type="dxa" w:w="2541"/>
             <w:shd w:val="clear" w:color="auto" w:fill="F8FAFC"/>
           </w:tcPr>
           <w:p>
@@ -23115,7 +23228,26 @@
                 <w:b w:val="0"/>
                 <w:sz w:val="17"/>
               </w:rPr>
-              <w:t>Petugas menerima notifikasi; uji otomatis berjalan di CI</w:t>
+              <w:t>Presisi, recall, F1 per kategori; akurasi prioritas; confusion matrix vision</w:t>
+            </w:r>
+          </w:p>
+        </w:tc>
+        <w:tc>
+          <w:tcPr>
+            <w:tcW w:type="dxa" w:w="1051"/>
+            <w:shd w:val="clear" w:color="auto" w:fill="F8FAFC"/>
+          </w:tcPr>
+          <w:p>
+            <w:pPr>
+              <w:spacing w:before="0" w:after="0"/>
+            </w:pPr>
+            <w:r>
+              <w:rPr>
+                <w:rFonts w:ascii="Calibri" w:hAnsi="Calibri" w:cs="Calibri" w:eastAsia="Calibri"/>
+                <w:b w:val="0"/>
+                <w:sz w:val="17"/>
+              </w:rPr>
+              <w:t>Belum</w:t>
             </w:r>
           </w:p>
         </w:tc>
@@ -23126,73 +23258,91 @@
         </w:trPr>
         <w:tc>
           <w:tcPr>
-            <w:tcW w:type="dxa" w:w="1455"/>
-          </w:tcPr>
-          <w:p>
-            <w:pPr>
-              <w:spacing w:before="0" w:after="0"/>
-            </w:pPr>
-            <w:r>
-              <w:rPr>
-                <w:rFonts w:ascii="Calibri" w:hAnsi="Calibri" w:cs="Calibri" w:eastAsia="Calibri"/>
-                <w:b w:val="0"/>
-                <w:sz w:val="17"/>
-              </w:rPr>
-              <w:t>25 Nov–1 Des</w:t>
-            </w:r>
-          </w:p>
-        </w:tc>
-        <w:tc>
-          <w:tcPr>
-            <w:tcW w:type="dxa" w:w="3273"/>
-          </w:tcPr>
-          <w:p>
-            <w:pPr>
-              <w:spacing w:before="0" w:after="0"/>
-            </w:pPr>
-            <w:r>
-              <w:rPr>
-                <w:rFonts w:ascii="Calibri" w:hAnsi="Calibri" w:cs="Calibri" w:eastAsia="Calibri"/>
-                <w:b w:val="0"/>
-                <w:sz w:val="17"/>
-              </w:rPr>
-              <w:t>Uji coba lapangan dengan mahasiswa dan petugas; kuesioner System Usability Scale (SUS)</w:t>
-            </w:r>
-          </w:p>
-        </w:tc>
-        <w:tc>
-          <w:tcPr>
-            <w:tcW w:type="dxa" w:w="1637"/>
-          </w:tcPr>
-          <w:p>
-            <w:pPr>
-              <w:spacing w:before="0" w:after="0"/>
-            </w:pPr>
-            <w:r>
-              <w:rPr>
-                <w:rFonts w:ascii="Calibri" w:hAnsi="Calibri" w:cs="Calibri" w:eastAsia="Calibri"/>
-                <w:b w:val="0"/>
-                <w:sz w:val="17"/>
-              </w:rPr>
-              <w:t>Seluruh anggota</w:t>
-            </w:r>
-          </w:p>
-        </w:tc>
-        <w:tc>
-          <w:tcPr>
-            <w:tcW w:type="dxa" w:w="3273"/>
-          </w:tcPr>
-          <w:p>
-            <w:pPr>
-              <w:spacing w:before="0" w:after="0"/>
-            </w:pPr>
-            <w:r>
-              <w:rPr>
-                <w:rFonts w:ascii="Calibri" w:hAnsi="Calibri" w:cs="Calibri" w:eastAsia="Calibri"/>
-                <w:b w:val="0"/>
-                <w:sz w:val="17"/>
-              </w:rPr>
-              <w:t>Skor SUS, catatan masukan, data penggunaan nyata</w:t>
+            <w:tcW w:type="dxa" w:w="1314"/>
+          </w:tcPr>
+          <w:p>
+            <w:pPr>
+              <w:spacing w:before="0" w:after="0"/>
+            </w:pPr>
+            <w:r>
+              <w:rPr>
+                <w:rFonts w:ascii="Calibri" w:hAnsi="Calibri" w:cs="Calibri" w:eastAsia="Calibri"/>
+                <w:b w:val="0"/>
+                <w:sz w:val="17"/>
+              </w:rPr>
+              <w:t>28 Okt–3 Nov</w:t>
+            </w:r>
+          </w:p>
+        </w:tc>
+        <w:tc>
+          <w:tcPr>
+            <w:tcW w:type="dxa" w:w="3242"/>
+          </w:tcPr>
+          <w:p>
+            <w:pPr>
+              <w:spacing w:before="0" w:after="0"/>
+            </w:pPr>
+            <w:r>
+              <w:rPr>
+                <w:rFonts w:ascii="Calibri" w:hAnsi="Calibri" w:cs="Calibri" w:eastAsia="Calibri"/>
+                <w:b w:val="0"/>
+                <w:sz w:val="17"/>
+              </w:rPr>
+              <w:t>Pembatasan laju atau Cloudflare Turnstile saat melapor; PIN petugas; reset sandi supervisor</w:t>
+            </w:r>
+          </w:p>
+        </w:tc>
+        <w:tc>
+          <w:tcPr>
+            <w:tcW w:type="dxa" w:w="1490"/>
+          </w:tcPr>
+          <w:p>
+            <w:pPr>
+              <w:spacing w:before="0" w:after="0"/>
+            </w:pPr>
+            <w:r>
+              <w:rPr>
+                <w:rFonts w:ascii="Calibri" w:hAnsi="Calibri" w:cs="Calibri" w:eastAsia="Calibri"/>
+                <w:b w:val="0"/>
+                <w:sz w:val="17"/>
+              </w:rPr>
+              <w:t>[Nama] — backend</w:t>
+            </w:r>
+          </w:p>
+        </w:tc>
+        <w:tc>
+          <w:tcPr>
+            <w:tcW w:type="dxa" w:w="2541"/>
+          </w:tcPr>
+          <w:p>
+            <w:pPr>
+              <w:spacing w:before="0" w:after="0"/>
+            </w:pPr>
+            <w:r>
+              <w:rPr>
+                <w:rFonts w:ascii="Calibri" w:hAnsi="Calibri" w:cs="Calibri" w:eastAsia="Calibri"/>
+                <w:b w:val="0"/>
+                <w:sz w:val="17"/>
+              </w:rPr>
+              <w:t>Spam tertahan; status tidak bisa diubah atas nama petugas lain</w:t>
+            </w:r>
+          </w:p>
+        </w:tc>
+        <w:tc>
+          <w:tcPr>
+            <w:tcW w:type="dxa" w:w="1051"/>
+          </w:tcPr>
+          <w:p>
+            <w:pPr>
+              <w:spacing w:before="0" w:after="0"/>
+            </w:pPr>
+            <w:r>
+              <w:rPr>
+                <w:rFonts w:ascii="Calibri" w:hAnsi="Calibri" w:cs="Calibri" w:eastAsia="Calibri"/>
+                <w:b w:val="0"/>
+                <w:sz w:val="17"/>
+              </w:rPr>
+              <w:t>Belum</w:t>
             </w:r>
           </w:p>
         </w:tc>
@@ -23203,7 +23353,7 @@
         </w:trPr>
         <w:tc>
           <w:tcPr>
-            <w:tcW w:type="dxa" w:w="1455"/>
+            <w:tcW w:type="dxa" w:w="1314"/>
             <w:shd w:val="clear" w:color="auto" w:fill="F8FAFC"/>
           </w:tcPr>
           <w:p>
@@ -23216,13 +23366,13 @@
                 <w:b w:val="0"/>
                 <w:sz w:val="17"/>
               </w:rPr>
-              <w:t>2–8 Des</w:t>
-            </w:r>
-          </w:p>
-        </w:tc>
-        <w:tc>
-          <w:tcPr>
-            <w:tcW w:type="dxa" w:w="3273"/>
+              <w:t>4–10 Nov</w:t>
+            </w:r>
+          </w:p>
+        </w:tc>
+        <w:tc>
+          <w:tcPr>
+            <w:tcW w:type="dxa" w:w="3242"/>
             <w:shd w:val="clear" w:color="auto" w:fill="F8FAFC"/>
           </w:tcPr>
           <w:p>
@@ -23235,13 +23385,13 @@
                 <w:b w:val="0"/>
                 <w:sz w:val="17"/>
               </w:rPr>
-              <w:t>Perbaikan dari uji lapangan; finalisasi dokumentasi dan laporan akhir</w:t>
-            </w:r>
-          </w:p>
-        </w:tc>
-        <w:tc>
-          <w:tcPr>
-            <w:tcW w:type="dxa" w:w="1637"/>
+              <w:t>Rekap manajerial (mingguan, bulanan, per lokasi, per petugas), KPI SLA, filter kategori; ekspor CSV, Excel, dan PDF</w:t>
+            </w:r>
+          </w:p>
+        </w:tc>
+        <w:tc>
+          <w:tcPr>
+            <w:tcW w:type="dxa" w:w="1490"/>
             <w:shd w:val="clear" w:color="auto" w:fill="F8FAFC"/>
           </w:tcPr>
           <w:p>
@@ -23254,13 +23404,13 @@
                 <w:b w:val="0"/>
                 <w:sz w:val="17"/>
               </w:rPr>
-              <w:t>[Nama] — dokumentasi</w:t>
-            </w:r>
-          </w:p>
-        </w:tc>
-        <w:tc>
-          <w:tcPr>
-            <w:tcW w:type="dxa" w:w="3273"/>
+              <w:t>[Nama] — backend &amp; frontend</w:t>
+            </w:r>
+          </w:p>
+        </w:tc>
+        <w:tc>
+          <w:tcPr>
+            <w:tcW w:type="dxa" w:w="2541"/>
             <w:shd w:val="clear" w:color="auto" w:fill="F8FAFC"/>
           </w:tcPr>
           <w:p>
@@ -23273,7 +23423,26 @@
                 <w:b w:val="0"/>
                 <w:sz w:val="17"/>
               </w:rPr>
-              <w:t>Laporan akhir, README final, PDF dokumentasi</w:t>
+              <w:t>Halaman rekap manajerial sesuai mockup A.9; tiga format ekspor berjalan</w:t>
+            </w:r>
+          </w:p>
+        </w:tc>
+        <w:tc>
+          <w:tcPr>
+            <w:tcW w:type="dxa" w:w="1051"/>
+            <w:shd w:val="clear" w:color="auto" w:fill="F8FAFC"/>
+          </w:tcPr>
+          <w:p>
+            <w:pPr>
+              <w:spacing w:before="0" w:after="0"/>
+            </w:pPr>
+            <w:r>
+              <w:rPr>
+                <w:rFonts w:ascii="Calibri" w:hAnsi="Calibri" w:cs="Calibri" w:eastAsia="Calibri"/>
+                <w:b w:val="0"/>
+                <w:sz w:val="17"/>
+              </w:rPr>
+              <w:t>Belum</w:t>
             </w:r>
           </w:p>
         </w:tc>
@@ -23284,43 +23453,141 @@
         </w:trPr>
         <w:tc>
           <w:tcPr>
-            <w:tcW w:type="dxa" w:w="1455"/>
-          </w:tcPr>
-          <w:p>
-            <w:pPr>
-              <w:spacing w:before="0" w:after="0"/>
-            </w:pPr>
-            <w:r>
-              <w:rPr>
-                <w:rFonts w:ascii="Calibri" w:hAnsi="Calibri" w:cs="Calibri" w:eastAsia="Calibri"/>
-                <w:b w:val="0"/>
-                <w:sz w:val="17"/>
-              </w:rPr>
-              <w:t>9–15 Des</w:t>
-            </w:r>
-          </w:p>
-        </w:tc>
-        <w:tc>
-          <w:tcPr>
-            <w:tcW w:type="dxa" w:w="3273"/>
-          </w:tcPr>
-          <w:p>
-            <w:pPr>
-              <w:spacing w:before="0" w:after="0"/>
-            </w:pPr>
-            <w:r>
-              <w:rPr>
-                <w:rFonts w:ascii="Calibri" w:hAnsi="Calibri" w:cs="Calibri" w:eastAsia="Calibri"/>
-                <w:b w:val="0"/>
-                <w:sz w:val="17"/>
-              </w:rPr>
-              <w:t>Persiapan presentasi dan demo UAS</w:t>
-            </w:r>
-          </w:p>
-        </w:tc>
-        <w:tc>
-          <w:tcPr>
-            <w:tcW w:type="dxa" w:w="1637"/>
+            <w:tcW w:type="dxa" w:w="1314"/>
+          </w:tcPr>
+          <w:p>
+            <w:pPr>
+              <w:spacing w:before="0" w:after="0"/>
+            </w:pPr>
+            <w:r>
+              <w:rPr>
+                <w:rFonts w:ascii="Calibri" w:hAnsi="Calibri" w:cs="Calibri" w:eastAsia="Calibri"/>
+                <w:b w:val="0"/>
+                <w:sz w:val="17"/>
+              </w:rPr>
+              <w:t>11–17 Nov</w:t>
+            </w:r>
+          </w:p>
+        </w:tc>
+        <w:tc>
+          <w:tcPr>
+            <w:tcW w:type="dxa" w:w="3242"/>
+          </w:tcPr>
+          <w:p>
+            <w:pPr>
+              <w:spacing w:before="0" w:after="0"/>
+            </w:pPr>
+            <w:r>
+              <w:rPr>
+                <w:rFonts w:ascii="Calibri" w:hAnsi="Calibri" w:cs="Calibri" w:eastAsia="Calibri"/>
+                <w:b w:val="0"/>
+                <w:sz w:val="17"/>
+              </w:rPr>
+              <w:t>Notifikasi prioritas tinggi; penutupan laporan dari log pekerjaan; uji otomatis (Vitest)</w:t>
+            </w:r>
+          </w:p>
+        </w:tc>
+        <w:tc>
+          <w:tcPr>
+            <w:tcW w:type="dxa" w:w="1490"/>
+          </w:tcPr>
+          <w:p>
+            <w:pPr>
+              <w:spacing w:before="0" w:after="0"/>
+            </w:pPr>
+            <w:r>
+              <w:rPr>
+                <w:rFonts w:ascii="Calibri" w:hAnsi="Calibri" w:cs="Calibri" w:eastAsia="Calibri"/>
+                <w:b w:val="0"/>
+                <w:sz w:val="17"/>
+              </w:rPr>
+              <w:t>[Nama] — backend &amp; QA</w:t>
+            </w:r>
+          </w:p>
+        </w:tc>
+        <w:tc>
+          <w:tcPr>
+            <w:tcW w:type="dxa" w:w="2541"/>
+          </w:tcPr>
+          <w:p>
+            <w:pPr>
+              <w:spacing w:before="0" w:after="0"/>
+            </w:pPr>
+            <w:r>
+              <w:rPr>
+                <w:rFonts w:ascii="Calibri" w:hAnsi="Calibri" w:cs="Calibri" w:eastAsia="Calibri"/>
+                <w:b w:val="0"/>
+                <w:sz w:val="17"/>
+              </w:rPr>
+              <w:t>Petugas menerima notifikasi; uji otomatis berjalan di CI</w:t>
+            </w:r>
+          </w:p>
+        </w:tc>
+        <w:tc>
+          <w:tcPr>
+            <w:tcW w:type="dxa" w:w="1051"/>
+          </w:tcPr>
+          <w:p>
+            <w:pPr>
+              <w:spacing w:before="0" w:after="0"/>
+            </w:pPr>
+            <w:r>
+              <w:rPr>
+                <w:rFonts w:ascii="Calibri" w:hAnsi="Calibri" w:cs="Calibri" w:eastAsia="Calibri"/>
+                <w:b w:val="0"/>
+                <w:sz w:val="17"/>
+              </w:rPr>
+              <w:t>Belum</w:t>
+            </w:r>
+          </w:p>
+        </w:tc>
+      </w:tr>
+      <w:tr>
+        <w:trPr>
+          <w:cantSplit/>
+        </w:trPr>
+        <w:tc>
+          <w:tcPr>
+            <w:tcW w:type="dxa" w:w="1314"/>
+            <w:shd w:val="clear" w:color="auto" w:fill="F8FAFC"/>
+          </w:tcPr>
+          <w:p>
+            <w:pPr>
+              <w:spacing w:before="0" w:after="0"/>
+            </w:pPr>
+            <w:r>
+              <w:rPr>
+                <w:rFonts w:ascii="Calibri" w:hAnsi="Calibri" w:cs="Calibri" w:eastAsia="Calibri"/>
+                <w:b w:val="0"/>
+                <w:sz w:val="17"/>
+              </w:rPr>
+              <w:t>18–24 Nov</w:t>
+            </w:r>
+          </w:p>
+        </w:tc>
+        <w:tc>
+          <w:tcPr>
+            <w:tcW w:type="dxa" w:w="3242"/>
+            <w:shd w:val="clear" w:color="auto" w:fill="F8FAFC"/>
+          </w:tcPr>
+          <w:p>
+            <w:pPr>
+              <w:spacing w:before="0" w:after="0"/>
+            </w:pPr>
+            <w:r>
+              <w:rPr>
+                <w:rFonts w:ascii="Calibri" w:hAnsi="Calibri" w:cs="Calibri" w:eastAsia="Calibri"/>
+                <w:b w:val="0"/>
+                <w:sz w:val="17"/>
+              </w:rPr>
+              <w:t>Uji coba lapangan dengan mahasiswa dan petugas; kuesioner System Usability Scale (SUS)</w:t>
+            </w:r>
+          </w:p>
+        </w:tc>
+        <w:tc>
+          <w:tcPr>
+            <w:tcW w:type="dxa" w:w="1490"/>
+            <w:shd w:val="clear" w:color="auto" w:fill="F8FAFC"/>
           </w:tcPr>
           <w:p>
             <w:pPr>
@@ -23338,19 +23605,134 @@
         </w:tc>
         <w:tc>
           <w:tcPr>
-            <w:tcW w:type="dxa" w:w="3273"/>
-          </w:tcPr>
-          <w:p>
-            <w:pPr>
-              <w:spacing w:before="0" w:after="0"/>
-            </w:pPr>
-            <w:r>
-              <w:rPr>
-                <w:rFonts w:ascii="Calibri" w:hAnsi="Calibri" w:cs="Calibri" w:eastAsia="Calibri"/>
-                <w:b w:val="0"/>
-                <w:sz w:val="17"/>
-              </w:rPr>
-              <w:t>Slide presentasi, skenario demo, video cadangan</w:t>
+            <w:tcW w:type="dxa" w:w="2541"/>
+            <w:shd w:val="clear" w:color="auto" w:fill="F8FAFC"/>
+          </w:tcPr>
+          <w:p>
+            <w:pPr>
+              <w:spacing w:before="0" w:after="0"/>
+            </w:pPr>
+            <w:r>
+              <w:rPr>
+                <w:rFonts w:ascii="Calibri" w:hAnsi="Calibri" w:cs="Calibri" w:eastAsia="Calibri"/>
+                <w:b w:val="0"/>
+                <w:sz w:val="17"/>
+              </w:rPr>
+              <w:t>Skor SUS, catatan masukan, data penggunaan nyata</w:t>
+            </w:r>
+          </w:p>
+        </w:tc>
+        <w:tc>
+          <w:tcPr>
+            <w:tcW w:type="dxa" w:w="1051"/>
+            <w:shd w:val="clear" w:color="auto" w:fill="F8FAFC"/>
+          </w:tcPr>
+          <w:p>
+            <w:pPr>
+              <w:spacing w:before="0" w:after="0"/>
+            </w:pPr>
+            <w:r>
+              <w:rPr>
+                <w:rFonts w:ascii="Calibri" w:hAnsi="Calibri" w:cs="Calibri" w:eastAsia="Calibri"/>
+                <w:b w:val="0"/>
+                <w:sz w:val="17"/>
+              </w:rPr>
+              <w:t>Belum</w:t>
+            </w:r>
+          </w:p>
+        </w:tc>
+      </w:tr>
+      <w:tr>
+        <w:trPr>
+          <w:cantSplit/>
+        </w:trPr>
+        <w:tc>
+          <w:tcPr>
+            <w:tcW w:type="dxa" w:w="1314"/>
+          </w:tcPr>
+          <w:p>
+            <w:pPr>
+              <w:spacing w:before="0" w:after="0"/>
+            </w:pPr>
+            <w:r>
+              <w:rPr>
+                <w:rFonts w:ascii="Calibri" w:hAnsi="Calibri" w:cs="Calibri" w:eastAsia="Calibri"/>
+                <w:b w:val="0"/>
+                <w:sz w:val="17"/>
+              </w:rPr>
+              <w:t>25–30 Nov</w:t>
+            </w:r>
+          </w:p>
+        </w:tc>
+        <w:tc>
+          <w:tcPr>
+            <w:tcW w:type="dxa" w:w="3242"/>
+          </w:tcPr>
+          <w:p>
+            <w:pPr>
+              <w:spacing w:before="0" w:after="0"/>
+            </w:pPr>
+            <w:r>
+              <w:rPr>
+                <w:rFonts w:ascii="Calibri" w:hAnsi="Calibri" w:cs="Calibri" w:eastAsia="Calibri"/>
+                <w:b w:val="0"/>
+                <w:sz w:val="17"/>
+              </w:rPr>
+              <w:t>Perbaikan dari uji lapangan; finalisasi dokumentasi dan laporan akhir; persiapan presentasi dan demo UAS</w:t>
+            </w:r>
+          </w:p>
+        </w:tc>
+        <w:tc>
+          <w:tcPr>
+            <w:tcW w:type="dxa" w:w="1490"/>
+          </w:tcPr>
+          <w:p>
+            <w:pPr>
+              <w:spacing w:before="0" w:after="0"/>
+            </w:pPr>
+            <w:r>
+              <w:rPr>
+                <w:rFonts w:ascii="Calibri" w:hAnsi="Calibri" w:cs="Calibri" w:eastAsia="Calibri"/>
+                <w:b w:val="0"/>
+                <w:sz w:val="17"/>
+              </w:rPr>
+              <w:t>Seluruh anggota</w:t>
+            </w:r>
+          </w:p>
+        </w:tc>
+        <w:tc>
+          <w:tcPr>
+            <w:tcW w:type="dxa" w:w="2541"/>
+          </w:tcPr>
+          <w:p>
+            <w:pPr>
+              <w:spacing w:before="0" w:after="0"/>
+            </w:pPr>
+            <w:r>
+              <w:rPr>
+                <w:rFonts w:ascii="Calibri" w:hAnsi="Calibri" w:cs="Calibri" w:eastAsia="Calibri"/>
+                <w:b w:val="0"/>
+                <w:sz w:val="17"/>
+              </w:rPr>
+              <w:t>Laporan akhir, README final, slide, skenario demo, video cadangan</w:t>
+            </w:r>
+          </w:p>
+        </w:tc>
+        <w:tc>
+          <w:tcPr>
+            <w:tcW w:type="dxa" w:w="1051"/>
+          </w:tcPr>
+          <w:p>
+            <w:pPr>
+              <w:spacing w:before="0" w:after="0"/>
+            </w:pPr>
+            <w:r>
+              <w:rPr>
+                <w:rFonts w:ascii="Calibri" w:hAnsi="Calibri" w:cs="Calibri" w:eastAsia="Calibri"/>
+                <w:b w:val="0"/>
+                <w:sz w:val="17"/>
+              </w:rPr>
+              <w:t>Belum</w:t>
             </w:r>
           </w:p>
         </w:tc>

</xml_diff>